<commit_message>
Complete community publication copy and IUI demo submission package
</commit_message>
<xml_diff>
--- a/output/publication/ai-fms-multichannel-release-2026-08-25/02-openai-developer-community/AI-FMS_OpenAI_Developer_Community_Article.docx
+++ b/output/publication/ai-fms-multichannel-release-2026-08-25/02-openai-developer-community/AI-FMS_OpenAI_Developer_Community_Article.docx
@@ -65,7 +65,7 @@
           <w:color w:val="5F7279"/>
           <w:sz w:val="21"/>
         </w:rPr>
-        <w:t>Haoran Zhu</w:t>
+        <w:t>Haoran ZHU</w:t>
       </w:r>
     </w:p>
     <w:p>
@@ -109,7 +109,7 @@
           <w:color w:val="5F7279"/>
           <w:sz w:val="21"/>
         </w:rPr>
-        <w:t>Draft for author voice and factual review</w:t>
+        <w:t>Ready for community posting; not yet published</w:t>
       </w:r>
     </w:p>
     <w:p>
@@ -131,7 +131,7 @@
           <w:color w:val="5F7279"/>
           <w:sz w:val="21"/>
         </w:rPr>
-        <w:t>26 August 2026</w:t>
+        <w:t>3 October 2026</w:t>
       </w:r>
     </w:p>
     <w:p>
@@ -317,7 +317,7 @@
         <w:rPr>
           <w:rFonts w:ascii="Arial" w:hAnsi="Arial"/>
         </w:rPr>
-        <w:t>What Codex was genuinely good at</w:t>
+        <w:t>Where Codex helped</w:t>
       </w:r>
     </w:p>
     <w:p>
@@ -1231,7 +1231,7 @@
           <w:rFonts w:ascii="Arial" w:hAnsi="Arial"/>
           <w:sz w:val="21"/>
         </w:rPr>
-        <w:t>We are preparing a privacy-safe public demo and an ACM IUI 2027 demonstration submission focused on explanation, abstention, and reviewer control.</w:t>
+        <w:t>The public project showcase and system demonstration accompany the published preprint. An ACM IUI 2027 demonstration package focuses on explanation, abstention, and reviewer control; it has not yet been submitted.</w:t>
       </w:r>
     </w:p>
     <w:p>
@@ -1247,17 +1247,7 @@
           <w:rFonts w:ascii="Arial" w:hAnsi="Arial"/>
           <w:sz w:val="21"/>
         </w:rPr>
-        <w:t xml:space="preserve">Preprint and methods: </w:t>
-      </w:r>
-      <w:r>
-        <w:rPr>
-          <w:b w:val="0"/>
-          <w:i w:val="0"/>
-          <w:color w:val="7A5A00"/>
-          <w:sz w:val="21"/>
-          <w:highlight w:val="yellow"/>
-        </w:rPr>
-        <w:t>[ZENODO DOI URL]</w:t>
+        <w:t>Preprint and methods: https://zenodo.org/records/23118144</w:t>
       </w:r>
     </w:p>
     <w:p>
@@ -1273,17 +1263,7 @@
           <w:rFonts w:ascii="Arial" w:hAnsi="Arial"/>
           <w:sz w:val="21"/>
         </w:rPr>
-        <w:t xml:space="preserve">Public repository: </w:t>
-      </w:r>
-      <w:r>
-        <w:rPr>
-          <w:b w:val="0"/>
-          <w:i w:val="0"/>
-          <w:color w:val="7A5A00"/>
-          <w:sz w:val="21"/>
-          <w:highlight w:val="yellow"/>
-        </w:rPr>
-        <w:t>[GITHUB URL]</w:t>
+        <w:t>Public repository: https://github.com/edwardzhu-HK/AI-FMS</w:t>
       </w:r>
     </w:p>
     <w:p>
@@ -1299,43 +1279,7 @@
           <w:rFonts w:ascii="Arial" w:hAnsi="Arial"/>
           <w:sz w:val="21"/>
         </w:rPr>
-        <w:t xml:space="preserve">Privacy-safe demo: </w:t>
-      </w:r>
-      <w:r>
-        <w:rPr>
-          <w:b w:val="0"/>
-          <w:i w:val="0"/>
-          <w:color w:val="7A5A00"/>
-          <w:sz w:val="21"/>
-          <w:highlight w:val="yellow"/>
-        </w:rPr>
-        <w:t>[DEMO URL]</w:t>
-      </w:r>
-    </w:p>
-    <w:p>
-      <w:pPr>
-        <w:spacing w:after="80" w:line="278" w:lineRule="auto"/>
-        <w:numPr>
-          <w:ilvl w:val="0"/>
-          <w:numId w:val="10"/>
-        </w:numPr>
-      </w:pPr>
-      <w:r>
-        <w:rPr>
-          <w:rFonts w:ascii="Arial" w:hAnsi="Arial"/>
-          <w:sz w:val="21"/>
-        </w:rPr>
-        <w:t xml:space="preserve">4:30 project overview: </w:t>
-      </w:r>
-      <w:r>
-        <w:rPr>
-          <w:b w:val="0"/>
-          <w:i w:val="0"/>
-          <w:color w:val="7A5A00"/>
-          <w:sz w:val="21"/>
-          <w:highlight w:val="yellow"/>
-        </w:rPr>
-        <w:t>[VIDEO URL]</w:t>
+        <w:t>Project showcase and system demonstration: https://edwardzhu-hk.github.io/AI-FMS/</w:t>
       </w:r>
     </w:p>
     <w:p>
@@ -1369,7 +1313,7 @@
           <w:rFonts w:ascii="Arial" w:hAnsi="Arial"/>
           <w:sz w:val="21"/>
         </w:rPr>
-        <w:t xml:space="preserve"> OpenAI Codex assisted implementation, testing, analysis tooling, figure preparation, editing, and portions of this draft under human direction. Human authors reviewed the evidence, corrected errors, verified the numbers and references, and take responsibility for the final content. AI-FMS is a movement-screening and review project, not a medical diagnostic or injury-prediction system.</w:t>
+        <w:t xml:space="preserve"> OpenAI Codex assisted implementation, testing, analysis tooling, figure preparation, editing, and portions of this draft under human direction. The human author reviewed the evidence, corrected errors, verified the numbers and references, and takes responsibility for the final content. AI-FMS is a movement-screening and review project, not a medical diagnostic or injury-prediction system.</w:t>
       </w:r>
     </w:p>
     <w:sectPr>

</xml_diff>